<commit_message>
Update repository from CheckPoint directory
- Renamed PYNQ FILES to PYNQ with updated content, preserving README.md
- Replaced ALTIUM directory with latest PCB design from checkpoint
- Added clock_configuration_for_zynq directory with configuration files
- Refreshed DATASHEETS AND DOCUMENTS with latest files
- Kept existing directories (docs, xsa, VIVADO script, projectHW_ADC_build)

All updates synchronized from: C:\Users\shtomer\WIS_work\CheckPoint
</commit_message>
<xml_diff>
--- a/DATASHEETS AND DOCUMENTS/שימוש בתוכנה לטובת כיול שעון.docx
+++ b/DATASHEETS AND DOCUMENTS/שימוש בתוכנה לטובת כיול שעון.docx
@@ -54,6 +54,7 @@
           <w:rFonts w:cs="Arial"/>
           <w:b/>
           <w:bCs/>
+          <w:noProof/>
           <w:rtl/>
         </w:rPr>
         <w:drawing>
@@ -175,11 +176,12 @@
           <w:rFonts w:cs="Arial"/>
           <w:b/>
           <w:bCs/>
+          <w:noProof/>
           <w:u w:val="single"/>
           <w:rtl/>
         </w:rPr>
         <w:drawing>
-          <wp:anchor distT="0" distB="0" distL="114300" distR="114300" simplePos="0" relativeHeight="251659264" behindDoc="0" locked="0" layoutInCell="1" allowOverlap="1" wp14:anchorId="1020B51C" wp14:editId="6D6E3281">
+          <wp:anchor distT="0" distB="0" distL="114300" distR="114300" simplePos="0" relativeHeight="251659264" behindDoc="0" locked="0" layoutInCell="1" allowOverlap="1" wp14:anchorId="1020B51C" wp14:editId="02302FCA">
             <wp:simplePos x="0" y="0"/>
             <wp:positionH relativeFrom="margin">
               <wp:align>center</wp:align>
@@ -241,7 +243,27 @@
           <w:bCs/>
           <w:rtl/>
         </w:rPr>
-        <w:t>על מנת להוציא בקלות מילת כיול חדשה (מומלץ, האלטרנטיבה היא לעבוד עם הדאטאשיט ולחשב ביט-ביט), יש להוריד תוכנת ה</w:t>
+        <w:t xml:space="preserve">על מנת להוציא בקלות מילת כיול חדשה (מומלץ, האלטרנטיבה היא לעבוד עם </w:t>
+      </w:r>
+      <w:proofErr w:type="spellStart"/>
+      <w:r>
+        <w:rPr>
+          <w:rFonts w:hint="cs"/>
+          <w:b/>
+          <w:bCs/>
+          <w:rtl/>
+        </w:rPr>
+        <w:t>הדאטאשיט</w:t>
+      </w:r>
+      <w:proofErr w:type="spellEnd"/>
+      <w:r>
+        <w:rPr>
+          <w:rFonts w:hint="cs"/>
+          <w:b/>
+          <w:bCs/>
+          <w:rtl/>
+        </w:rPr>
+        <w:t xml:space="preserve"> ולחשב ביט-ביט), יש להוריד תוכנת ה</w:t>
       </w:r>
       <w:r>
         <w:rPr>
@@ -324,7 +346,6 @@
       <w:pPr>
         <w:pStyle w:val="ListParagraph"/>
         <w:rPr>
-          <w:rFonts w:hint="cs"/>
           <w:b/>
           <w:bCs/>
           <w:u w:val="single"/>
@@ -349,6 +370,7 @@
       <w:r>
         <w:rPr>
           <w:rFonts w:cs="Arial"/>
+          <w:noProof/>
           <w:rtl/>
         </w:rPr>
         <w:drawing>
@@ -482,23 +504,146 @@
           <w:rFonts w:hint="cs"/>
           <w:b/>
           <w:bCs/>
+          <w:u w:val="single"/>
           <w:rtl/>
         </w:rPr>
         <w:lastRenderedPageBreak/>
-        <w:t>תצורות השעון שצריך לכל רכיב:</w:t>
+        <w:t>חשוב:</w:t>
+      </w:r>
+      <w:r>
+        <w:rPr>
+          <w:rFonts w:hint="cs"/>
+          <w:b/>
+          <w:bCs/>
+          <w:rtl/>
+        </w:rPr>
+        <w:t xml:space="preserve"> לעבוד בתוכנה </w:t>
+      </w:r>
+      <w:proofErr w:type="spellStart"/>
+      <w:r>
+        <w:rPr>
+          <w:rFonts w:hint="cs"/>
+          <w:b/>
+          <w:bCs/>
+          <w:rtl/>
+        </w:rPr>
+        <w:t>כשרק</w:t>
+      </w:r>
+      <w:proofErr w:type="spellEnd"/>
+      <w:r>
+        <w:rPr>
+          <w:rFonts w:hint="cs"/>
+          <w:b/>
+          <w:bCs/>
+          <w:rtl/>
+        </w:rPr>
+        <w:t xml:space="preserve"> שעון </w:t>
+      </w:r>
+      <w:r>
+        <w:rPr>
+          <w:b/>
+          <w:bCs/>
+        </w:rPr>
+        <w:t>PRI</w:t>
+      </w:r>
+      <w:r>
+        <w:rPr>
+          <w:rFonts w:hint="cs"/>
+          <w:b/>
+          <w:bCs/>
+          <w:rtl/>
+        </w:rPr>
+        <w:t xml:space="preserve"> מאופשר אחרת מאבד נעילה כל כמה דקות.</w:t>
       </w:r>
     </w:p>
     <w:p>
       <w:pPr>
         <w:pStyle w:val="ListParagraph"/>
-        <w:rPr>
-          <w:rFonts w:hint="cs"/>
+        <w:bidi/>
+        <w:rPr>
           <w:b/>
           <w:bCs/>
           <w:u w:val="single"/>
-          <w:rtl/>
-        </w:rPr>
-      </w:pPr>
+        </w:rPr>
+      </w:pPr>
+      <w:r>
+        <w:rPr>
+          <w:b/>
+          <w:bCs/>
+          <w:u w:val="single"/>
+        </w:rPr>
+        <w:drawing>
+          <wp:inline distT="0" distB="0" distL="0" distR="0" wp14:anchorId="7917D7B9" wp14:editId="22BBD47D">
+            <wp:extent cx="4838949" cy="1879697"/>
+            <wp:effectExtent l="0" t="0" r="0" b="6350"/>
+            <wp:docPr id="1914345439" name="Picture 1"/>
+            <wp:cNvGraphicFramePr>
+              <a:graphicFrameLocks xmlns:a="http://schemas.openxmlformats.org/drawingml/2006/main" noChangeAspect="1"/>
+            </wp:cNvGraphicFramePr>
+            <a:graphic xmlns:a="http://schemas.openxmlformats.org/drawingml/2006/main">
+              <a:graphicData uri="http://schemas.openxmlformats.org/drawingml/2006/picture">
+                <pic:pic xmlns:pic="http://schemas.openxmlformats.org/drawingml/2006/picture">
+                  <pic:nvPicPr>
+                    <pic:cNvPr id="1914345439" name=""/>
+                    <pic:cNvPicPr/>
+                  </pic:nvPicPr>
+                  <pic:blipFill>
+                    <a:blip r:embed="rId9"/>
+                    <a:stretch>
+                      <a:fillRect/>
+                    </a:stretch>
+                  </pic:blipFill>
+                  <pic:spPr>
+                    <a:xfrm>
+                      <a:off x="0" y="0"/>
+                      <a:ext cx="4838949" cy="1879697"/>
+                    </a:xfrm>
+                    <a:prstGeom prst="rect">
+                      <a:avLst/>
+                    </a:prstGeom>
+                  </pic:spPr>
+                </pic:pic>
+              </a:graphicData>
+            </a:graphic>
+          </wp:inline>
+        </w:drawing>
+      </w:r>
+    </w:p>
+    <w:p>
+      <w:pPr>
+        <w:pStyle w:val="ListParagraph"/>
+        <w:rPr>
+          <w:rFonts w:hint="cs"/>
+          <w:b/>
+          <w:bCs/>
+          <w:rtl/>
+        </w:rPr>
+      </w:pPr>
+    </w:p>
+    <w:p>
+      <w:pPr>
+        <w:pStyle w:val="ListParagraph"/>
+        <w:numPr>
+          <w:ilvl w:val="0"/>
+          <w:numId w:val="1"/>
+        </w:numPr>
+        <w:bidi/>
+        <w:rPr>
+          <w:b/>
+          <w:bCs/>
+          <w:u w:val="single"/>
+          <w:rtl/>
+        </w:rPr>
+      </w:pPr>
+      <w:r>
+        <w:rPr>
+          <w:rFonts w:hint="cs"/>
+          <w:b/>
+          <w:bCs/>
+          <w:rtl/>
+        </w:rPr>
+        <w:t>תצורות השעון שצריך לכל רכיב:</w:t>
+      </w:r>
     </w:p>
     <w:p>
       <w:pPr>
@@ -519,11 +664,13 @@
           <w:rFonts w:cs="Arial"/>
           <w:b/>
           <w:bCs/>
+          <w:noProof/>
           <w:u w:val="single"/>
           <w:rtl/>
         </w:rPr>
+        <w:lastRenderedPageBreak/>
         <w:drawing>
-          <wp:anchor distT="0" distB="0" distL="114300" distR="114300" simplePos="0" relativeHeight="251663360" behindDoc="0" locked="0" layoutInCell="1" allowOverlap="1" wp14:anchorId="0F648A37" wp14:editId="7B058047">
+          <wp:anchor distT="0" distB="0" distL="114300" distR="114300" simplePos="0" relativeHeight="251663360" behindDoc="0" locked="0" layoutInCell="1" allowOverlap="1" wp14:anchorId="0F648A37" wp14:editId="68832F38">
             <wp:simplePos x="0" y="0"/>
             <wp:positionH relativeFrom="margin">
               <wp:align>center</wp:align>
@@ -546,7 +693,7 @@
                     <pic:cNvPicPr/>
                   </pic:nvPicPr>
                   <pic:blipFill>
-                    <a:blip r:embed="rId9">
+                    <a:blip r:embed="rId10">
                       <a:extLst>
                         <a:ext uri="{28A0092B-C50C-407E-A947-70E740481C1C}">
                           <a14:useLocalDpi xmlns:a14="http://schemas.microsoft.com/office/drawing/2010/main" val="0"/>
@@ -583,11 +730,12 @@
           <w:rFonts w:cs="Arial"/>
           <w:b/>
           <w:bCs/>
+          <w:noProof/>
           <w:u w:val="single"/>
           <w:rtl/>
         </w:rPr>
         <w:drawing>
-          <wp:anchor distT="0" distB="0" distL="114300" distR="114300" simplePos="0" relativeHeight="251661312" behindDoc="0" locked="0" layoutInCell="1" allowOverlap="1" wp14:anchorId="4D478D4F" wp14:editId="528B2FBA">
+          <wp:anchor distT="0" distB="0" distL="114300" distR="114300" simplePos="0" relativeHeight="251661312" behindDoc="0" locked="0" layoutInCell="1" allowOverlap="1" wp14:anchorId="4D478D4F" wp14:editId="00D52CC6">
             <wp:simplePos x="0" y="0"/>
             <wp:positionH relativeFrom="margin">
               <wp:align>center</wp:align>
@@ -610,7 +758,7 @@
                     <pic:cNvPicPr/>
                   </pic:nvPicPr>
                   <pic:blipFill>
-                    <a:blip r:embed="rId10">
+                    <a:blip r:embed="rId11">
                       <a:extLst>
                         <a:ext uri="{28A0092B-C50C-407E-A947-70E740481C1C}">
                           <a14:useLocalDpi xmlns:a14="http://schemas.microsoft.com/office/drawing/2010/main" val="0"/>
@@ -656,7 +804,27 @@
           <w:bCs/>
           <w:rtl/>
         </w:rPr>
-        <w:t xml:space="preserve">: מתוך עמוד 14 בדאטאשיט- </w:t>
+        <w:t xml:space="preserve">: מתוך עמוד 14 </w:t>
+      </w:r>
+      <w:proofErr w:type="spellStart"/>
+      <w:r>
+        <w:rPr>
+          <w:rFonts w:hint="cs"/>
+          <w:b/>
+          <w:bCs/>
+          <w:rtl/>
+        </w:rPr>
+        <w:t>בדאטאשיט</w:t>
+      </w:r>
+      <w:proofErr w:type="spellEnd"/>
+      <w:r>
+        <w:rPr>
+          <w:rFonts w:hint="cs"/>
+          <w:b/>
+          <w:bCs/>
+          <w:rtl/>
+        </w:rPr>
+        <w:t xml:space="preserve">- </w:t>
       </w:r>
       <w:r>
         <w:rPr>
@@ -680,7 +848,47 @@
           <w:bCs/>
           <w:rtl/>
         </w:rPr>
-        <w:t>דורש טרמינציה של 150 אוהם.</w:t>
+        <w:t xml:space="preserve">דורש </w:t>
+      </w:r>
+      <w:proofErr w:type="spellStart"/>
+      <w:r>
+        <w:rPr>
+          <w:rFonts w:hint="cs"/>
+          <w:b/>
+          <w:bCs/>
+          <w:rtl/>
+        </w:rPr>
+        <w:t>טרמינציה</w:t>
+      </w:r>
+      <w:proofErr w:type="spellEnd"/>
+      <w:r>
+        <w:rPr>
+          <w:rFonts w:hint="cs"/>
+          <w:b/>
+          <w:bCs/>
+          <w:rtl/>
+        </w:rPr>
+        <w:t xml:space="preserve"> של 150 </w:t>
+      </w:r>
+      <w:proofErr w:type="spellStart"/>
+      <w:r>
+        <w:rPr>
+          <w:rFonts w:hint="cs"/>
+          <w:b/>
+          <w:bCs/>
+          <w:rtl/>
+        </w:rPr>
+        <w:t>אוהם</w:t>
+      </w:r>
+      <w:proofErr w:type="spellEnd"/>
+      <w:r>
+        <w:rPr>
+          <w:rFonts w:hint="cs"/>
+          <w:b/>
+          <w:bCs/>
+          <w:rtl/>
+        </w:rPr>
+        <w:t>.</w:t>
       </w:r>
       <w:r>
         <w:rPr>
@@ -710,6 +918,7 @@
           <w:rFonts w:cs="Arial"/>
           <w:b/>
           <w:bCs/>
+          <w:noProof/>
           <w:u w:val="single"/>
           <w:rtl/>
         </w:rPr>
@@ -738,7 +947,7 @@
                     <pic:cNvPicPr/>
                   </pic:nvPicPr>
                   <pic:blipFill>
-                    <a:blip r:embed="rId11">
+                    <a:blip r:embed="rId12">
                       <a:extLst>
                         <a:ext uri="{28A0092B-C50C-407E-A947-70E740481C1C}">
                           <a14:useLocalDpi xmlns:a14="http://schemas.microsoft.com/office/drawing/2010/main" val="0"/>
@@ -778,7 +987,27 @@
           <w:bCs/>
           <w:rtl/>
         </w:rPr>
-        <w:t xml:space="preserve">: יכול לעבוד עם כמה תצורות, הנסיון מראה שעם </w:t>
+        <w:t xml:space="preserve">: יכול לעבוד עם כמה תצורות, </w:t>
+      </w:r>
+      <w:proofErr w:type="spellStart"/>
+      <w:r>
+        <w:rPr>
+          <w:rFonts w:hint="cs"/>
+          <w:b/>
+          <w:bCs/>
+          <w:rtl/>
+        </w:rPr>
+        <w:t>הנסיון</w:t>
+      </w:r>
+      <w:proofErr w:type="spellEnd"/>
+      <w:r>
+        <w:rPr>
+          <w:rFonts w:hint="cs"/>
+          <w:b/>
+          <w:bCs/>
+          <w:rtl/>
+        </w:rPr>
+        <w:t xml:space="preserve"> מראה שעם </w:t>
       </w:r>
       <w:r>
         <w:rPr>
@@ -849,7 +1078,47 @@
           <w:bCs/>
           <w:rtl/>
         </w:rPr>
-        <w:t xml:space="preserve"> טרמינציה 150 אוהם.</w:t>
+        <w:t xml:space="preserve"> </w:t>
+      </w:r>
+      <w:proofErr w:type="spellStart"/>
+      <w:r>
+        <w:rPr>
+          <w:rFonts w:hint="cs"/>
+          <w:b/>
+          <w:bCs/>
+          <w:rtl/>
+        </w:rPr>
+        <w:t>טרמינציה</w:t>
+      </w:r>
+      <w:proofErr w:type="spellEnd"/>
+      <w:r>
+        <w:rPr>
+          <w:rFonts w:hint="cs"/>
+          <w:b/>
+          <w:bCs/>
+          <w:rtl/>
+        </w:rPr>
+        <w:t xml:space="preserve"> 150 </w:t>
+      </w:r>
+      <w:proofErr w:type="spellStart"/>
+      <w:r>
+        <w:rPr>
+          <w:rFonts w:hint="cs"/>
+          <w:b/>
+          <w:bCs/>
+          <w:rtl/>
+        </w:rPr>
+        <w:t>אוהם</w:t>
+      </w:r>
+      <w:proofErr w:type="spellEnd"/>
+      <w:r>
+        <w:rPr>
+          <w:rFonts w:hint="cs"/>
+          <w:b/>
+          <w:bCs/>
+          <w:rtl/>
+        </w:rPr>
+        <w:t>.</w:t>
       </w:r>
     </w:p>
     <w:p>
@@ -904,7 +1173,6 @@
       <w:pPr>
         <w:bidi/>
         <w:rPr>
-          <w:rFonts w:hint="cs"/>
           <w:b/>
           <w:bCs/>
           <w:u w:val="single"/>
@@ -925,6 +1193,119 @@
 <file path=word/numbering.xml><?xml version="1.0" encoding="utf-8"?>
 <w:numbering xmlns:wpc="http://schemas.microsoft.com/office/word/2010/wordprocessingCanvas" xmlns:cx="http://schemas.microsoft.com/office/drawing/2014/chartex" xmlns:cx1="http://schemas.microsoft.com/office/drawing/2015/9/8/chartex" xmlns:cx2="http://schemas.microsoft.com/office/drawing/2015/10/21/chartex" xmlns:cx3="http://schemas.microsoft.com/office/drawing/2016/5/9/chartex" xmlns:cx4="http://schemas.microsoft.com/office/drawing/2016/5/10/chartex" xmlns:cx5="http://schemas.microsoft.com/office/drawing/2016/5/11/chartex" xmlns:cx6="http://schemas.microsoft.com/office/drawing/2016/5/12/chartex" xmlns:cx7="http://schemas.microsoft.com/office/drawing/2016/5/13/chartex" xmlns:cx8="http://schemas.microsoft.com/office/drawing/2016/5/14/chartex" xmlns:mc="http://schemas.openxmlformats.org/markup-compatibility/2006" xmlns:aink="http://schemas.microsoft.com/office/drawing/2016/ink" xmlns:am3d="http://schemas.microsoft.com/office/drawing/2017/model3d" xmlns:o="urn:schemas-microsoft-com:office:office" xmlns:oel="http://schemas.microsoft.com/office/2019/extlst" xmlns:r="http://schemas.openxmlformats.org/officeDocument/2006/relationships" xmlns:m="http://schemas.openxmlformats.org/officeDocument/2006/math" xmlns:v="urn:schemas-microsoft-com:vml" xmlns:wp14="http://schemas.microsoft.com/office/word/2010/wordprocessingDrawing" xmlns:wp="http://schemas.openxmlformats.org/drawingml/2006/wordprocessingDrawing" xmlns:w10="urn:schemas-microsoft-com:office:word" xmlns:w="http://schemas.openxmlformats.org/wordprocessingml/2006/main" xmlns:w14="http://schemas.microsoft.com/office/word/2010/wordml" xmlns:w15="http://schemas.microsoft.com/office/word/2012/wordml" xmlns:w16cex="http://schemas.microsoft.com/office/word/2018/wordml/cex" xmlns:w16cid="http://schemas.microsoft.com/office/word/2016/wordml/cid" xmlns:w16="http://schemas.microsoft.com/office/word/2018/wordml" xmlns:w16du="http://schemas.microsoft.com/office/word/2023/wordml/word16du" xmlns:w16sdtdh="http://schemas.microsoft.com/office/word/2020/wordml/sdtdatahash" xmlns:w16sdtfl="http://schemas.microsoft.com/office/word/2024/wordml/sdtformatlock" xmlns:w16se="http://schemas.microsoft.com/office/word/2015/wordml/symex" xmlns:wpg="http://schemas.microsoft.com/office/word/2010/wordprocessingGroup" xmlns:wpi="http://schemas.microsoft.com/office/word/2010/wordprocessingInk" xmlns:wne="http://schemas.microsoft.com/office/word/2006/wordml" xmlns:wps="http://schemas.microsoft.com/office/word/2010/wordprocessingShape" mc:Ignorable="w14 w15 w16se w16cid w16 w16cex w16sdtdh w16sdtfl w16du wp14">
   <w:abstractNum w:abstractNumId="0" w15:restartNumberingAfterBreak="0">
+    <w:nsid w:val="1D667FB5"/>
+    <w:multiLevelType w:val="hybridMultilevel"/>
+    <w:tmpl w:val="3B5A3D28"/>
+    <w:lvl w:ilvl="0" w:tplc="106C4102">
+      <w:start w:val="6"/>
+      <w:numFmt w:val="bullet"/>
+      <w:lvlText w:val=""/>
+      <w:lvlJc w:val="left"/>
+      <w:pPr>
+        <w:ind w:left="720" w:hanging="360"/>
+      </w:pPr>
+      <w:rPr>
+        <w:rFonts w:ascii="Symbol" w:eastAsiaTheme="minorHAnsi" w:hAnsi="Symbol" w:cstheme="minorBidi" w:hint="default"/>
+      </w:rPr>
+    </w:lvl>
+    <w:lvl w:ilvl="1" w:tplc="04090003" w:tentative="1">
+      <w:start w:val="1"/>
+      <w:numFmt w:val="bullet"/>
+      <w:lvlText w:val="o"/>
+      <w:lvlJc w:val="left"/>
+      <w:pPr>
+        <w:ind w:left="1440" w:hanging="360"/>
+      </w:pPr>
+      <w:rPr>
+        <w:rFonts w:ascii="Courier New" w:hAnsi="Courier New" w:cs="Courier New" w:hint="default"/>
+      </w:rPr>
+    </w:lvl>
+    <w:lvl w:ilvl="2" w:tplc="04090005" w:tentative="1">
+      <w:start w:val="1"/>
+      <w:numFmt w:val="bullet"/>
+      <w:lvlText w:val=""/>
+      <w:lvlJc w:val="left"/>
+      <w:pPr>
+        <w:ind w:left="2160" w:hanging="360"/>
+      </w:pPr>
+      <w:rPr>
+        <w:rFonts w:ascii="Wingdings" w:hAnsi="Wingdings" w:hint="default"/>
+      </w:rPr>
+    </w:lvl>
+    <w:lvl w:ilvl="3" w:tplc="04090001" w:tentative="1">
+      <w:start w:val="1"/>
+      <w:numFmt w:val="bullet"/>
+      <w:lvlText w:val=""/>
+      <w:lvlJc w:val="left"/>
+      <w:pPr>
+        <w:ind w:left="2880" w:hanging="360"/>
+      </w:pPr>
+      <w:rPr>
+        <w:rFonts w:ascii="Symbol" w:hAnsi="Symbol" w:hint="default"/>
+      </w:rPr>
+    </w:lvl>
+    <w:lvl w:ilvl="4" w:tplc="04090003" w:tentative="1">
+      <w:start w:val="1"/>
+      <w:numFmt w:val="bullet"/>
+      <w:lvlText w:val="o"/>
+      <w:lvlJc w:val="left"/>
+      <w:pPr>
+        <w:ind w:left="3600" w:hanging="360"/>
+      </w:pPr>
+      <w:rPr>
+        <w:rFonts w:ascii="Courier New" w:hAnsi="Courier New" w:cs="Courier New" w:hint="default"/>
+      </w:rPr>
+    </w:lvl>
+    <w:lvl w:ilvl="5" w:tplc="04090005" w:tentative="1">
+      <w:start w:val="1"/>
+      <w:numFmt w:val="bullet"/>
+      <w:lvlText w:val=""/>
+      <w:lvlJc w:val="left"/>
+      <w:pPr>
+        <w:ind w:left="4320" w:hanging="360"/>
+      </w:pPr>
+      <w:rPr>
+        <w:rFonts w:ascii="Wingdings" w:hAnsi="Wingdings" w:hint="default"/>
+      </w:rPr>
+    </w:lvl>
+    <w:lvl w:ilvl="6" w:tplc="04090001" w:tentative="1">
+      <w:start w:val="1"/>
+      <w:numFmt w:val="bullet"/>
+      <w:lvlText w:val=""/>
+      <w:lvlJc w:val="left"/>
+      <w:pPr>
+        <w:ind w:left="5040" w:hanging="360"/>
+      </w:pPr>
+      <w:rPr>
+        <w:rFonts w:ascii="Symbol" w:hAnsi="Symbol" w:hint="default"/>
+      </w:rPr>
+    </w:lvl>
+    <w:lvl w:ilvl="7" w:tplc="04090003" w:tentative="1">
+      <w:start w:val="1"/>
+      <w:numFmt w:val="bullet"/>
+      <w:lvlText w:val="o"/>
+      <w:lvlJc w:val="left"/>
+      <w:pPr>
+        <w:ind w:left="5760" w:hanging="360"/>
+      </w:pPr>
+      <w:rPr>
+        <w:rFonts w:ascii="Courier New" w:hAnsi="Courier New" w:cs="Courier New" w:hint="default"/>
+      </w:rPr>
+    </w:lvl>
+    <w:lvl w:ilvl="8" w:tplc="04090005" w:tentative="1">
+      <w:start w:val="1"/>
+      <w:numFmt w:val="bullet"/>
+      <w:lvlText w:val=""/>
+      <w:lvlJc w:val="left"/>
+      <w:pPr>
+        <w:ind w:left="6480" w:hanging="360"/>
+      </w:pPr>
+      <w:rPr>
+        <w:rFonts w:ascii="Wingdings" w:hAnsi="Wingdings" w:hint="default"/>
+      </w:rPr>
+    </w:lvl>
+  </w:abstractNum>
+  <w:abstractNum w:abstractNumId="1" w15:restartNumberingAfterBreak="0">
     <w:nsid w:val="2FCD7EA8"/>
     <w:multiLevelType w:val="hybridMultilevel"/>
     <w:tmpl w:val="67489D6C"/>
@@ -1014,6 +1395,9 @@
     </w:lvl>
   </w:abstractNum>
   <w:num w:numId="1" w16cid:durableId="1098213370">
+    <w:abstractNumId w:val="1"/>
+  </w:num>
+  <w:num w:numId="2" w16cid:durableId="939989957">
     <w:abstractNumId w:val="0"/>
   </w:num>
 </w:numbering>

</xml_diff>